<commit_message>
Update Reflection & Checklist form
Co-Authored-By: Claude Opus 4.6 (1M context) <noreply@anthropic.com>
</commit_message>
<xml_diff>
--- a/assignments/1181-project1-reflection.docx
+++ b/assignments/1181-project1-reflection.docx
@@ -31,7 +31,10 @@
         <w:t xml:space="preserve">Instructions: </w:t>
       </w:r>
       <w:r>
-        <w:t>Complete this form after finishing your revised draft and before submitting it. Part 1 asks you to reflect on your writing and research process. Part 2 is a checklist to verify your draft meets all requirements. Submit this document along with your revised draft to Canvas.</w:t>
+        <w:t xml:space="preserve">Complete this form after finishing your revised draft and before submitting it. Part 1 asks you to reflect on your writing and process. Part 2 is a checklist to verify your draft meets all requirements. Submit this document </w:t>
+      </w:r>
+      <w:r>
+        <w:t xml:space="preserve">in Canvas. </w:t>
       </w:r>
     </w:p>
     <w:p>
@@ -719,10 +722,7 @@
         <w:pStyle w:val="Heading3"/>
       </w:pPr>
       <w:r>
-        <w:t>MLA</w:t>
-      </w:r>
-      <w:r>
-        <w:t xml:space="preserve"> Formatting</w:t>
+        <w:t>MLA Formatting</w:t>
       </w:r>
     </w:p>
     <w:tbl>
@@ -1272,7 +1272,7 @@
         <w:sz w:val="24"/>
         <w:szCs w:val="24"/>
       </w:rPr>
-      <w:instrText>3</w:instrText>
+      <w:instrText>2</w:instrText>
     </w:r>
     <w:r>
       <w:rPr>
@@ -1362,6 +1362,29 @@
         <w:szCs w:val="24"/>
       </w:rPr>
       <w:instrText xml:space="preserve"> "Continued on next page." </w:instrText>
+    </w:r>
+    <w:r>
+      <w:rPr>
+        <w:rFonts w:asciiTheme="majorHAnsi" w:hAnsiTheme="majorHAnsi" w:cstheme="majorHAnsi"/>
+        <w:i/>
+        <w:iCs/>
+        <w:color w:val="A50000"/>
+        <w:sz w:val="24"/>
+        <w:szCs w:val="24"/>
+      </w:rPr>
+      <w:fldChar w:fldCharType="separate"/>
+    </w:r>
+    <w:r>
+      <w:rPr>
+        <w:rFonts w:asciiTheme="majorHAnsi" w:hAnsiTheme="majorHAnsi" w:cstheme="majorHAnsi"/>
+        <w:i/>
+        <w:iCs/>
+        <w:noProof/>
+        <w:color w:val="A50000"/>
+        <w:sz w:val="24"/>
+        <w:szCs w:val="24"/>
+      </w:rPr>
+      <w:t>Continued on next page.</w:t>
     </w:r>
     <w:r>
       <w:rPr>
@@ -2850,6 +2873,7 @@
   <w:style w:type="character" w:default="1" w:styleId="DefaultParagraphFont">
     <w:name w:val="Default Paragraph Font"/>
     <w:uiPriority w:val="1"/>
+    <w:semiHidden/>
     <w:unhideWhenUsed/>
   </w:style>
   <w:style w:type="table" w:default="1" w:styleId="TableNormal">

</xml_diff>